<commit_message>
Updated codes for graphing, formatting the final report
</commit_message>
<xml_diff>
--- a/Draft_Final_Report.docx
+++ b/Draft_Final_Report.docx
@@ -38,7 +38,82 @@
           <w:iCs/>
           <w:sz w:val="24"/>
         </w:rPr>
-        <w:t>Eric C., Serena C.</w:t>
+        <w:t>Eric</w:t>
+      </w:r>
+      <w:r>
+        <w:rPr>
+          <w:rFonts w:ascii="Times New Roman" w:hAnsi="Times New Roman" w:cs="Times New Roman" w:hint="eastAsia"/>
+          <w:i/>
+          <w:iCs/>
+          <w:sz w:val="24"/>
+        </w:rPr>
+        <w:t xml:space="preserve"> </w:t>
+      </w:r>
+      <w:r>
+        <w:rPr>
+          <w:rFonts w:ascii="Times New Roman" w:hAnsi="Times New Roman" w:cs="Times New Roman"/>
+          <w:i/>
+          <w:iCs/>
+          <w:sz w:val="24"/>
+        </w:rPr>
+        <w:t>(TianXing)</w:t>
+      </w:r>
+      <w:r>
+        <w:rPr>
+          <w:rFonts w:ascii="Times New Roman" w:hAnsi="Times New Roman" w:cs="Times New Roman"/>
+          <w:i/>
+          <w:iCs/>
+          <w:sz w:val="24"/>
+        </w:rPr>
+        <w:t xml:space="preserve"> C</w:t>
+      </w:r>
+      <w:r>
+        <w:rPr>
+          <w:rFonts w:ascii="Times New Roman" w:hAnsi="Times New Roman" w:cs="Times New Roman"/>
+          <w:i/>
+          <w:iCs/>
+          <w:sz w:val="24"/>
+        </w:rPr>
+        <w:t>hen, 47368527</w:t>
+      </w:r>
+    </w:p>
+    <w:p>
+      <w:pPr>
+        <w:wordWrap w:val="0"/>
+        <w:jc w:val="right"/>
+        <w:rPr>
+          <w:rFonts w:ascii="Times New Roman" w:hAnsi="Times New Roman" w:cs="Times New Roman"/>
+          <w:i/>
+          <w:iCs/>
+          <w:sz w:val="24"/>
+        </w:rPr>
+      </w:pPr>
+      <w:r>
+        <w:rPr>
+          <w:rFonts w:ascii="Times New Roman" w:hAnsi="Times New Roman" w:cs="Times New Roman"/>
+          <w:i/>
+          <w:iCs/>
+          <w:sz w:val="24"/>
+        </w:rPr>
+        <w:t>Serena C</w:t>
+      </w:r>
+      <w:r>
+        <w:rPr>
+          <w:rFonts w:ascii="Times New Roman" w:hAnsi="Times New Roman" w:cs="Times New Roman"/>
+          <w:i/>
+          <w:iCs/>
+          <w:sz w:val="24"/>
+        </w:rPr>
+        <w:t xml:space="preserve">hen, </w:t>
+      </w:r>
+      <w:r>
+        <w:rPr>
+          <w:rFonts w:ascii="Times New Roman" w:hAnsi="Times New Roman" w:cs="Times New Roman"/>
+          <w:i/>
+          <w:iCs/>
+          <w:sz w:val="24"/>
+        </w:rPr>
+        <w:t>68696426</w:t>
       </w:r>
     </w:p>
     <w:p>
@@ -72,7 +147,39 @@
           <w:rFonts w:ascii="Times New Roman" w:hAnsi="Times New Roman" w:cs="Times New Roman"/>
           <w:sz w:val="24"/>
         </w:rPr>
-        <w:t>Understanding how different culinary traditions organize and combine ingredients gives us a view of identity and global food practices. In this study we build ingredient co‑occurrence networks from an available Kaggle dataset to look at patterns in Asian cuisine and Western cuisine. In the ingredient co‑occurrence networks each node is an ingredient and each weighted edge shows that the ingredient co‑occurs with another ingredient in a recipe. First we compare the two cuisine groups by looking at network size, network density and centrality distributions. Then we point out core ingredients that act as backbones, in each culinary system. We first put the two data sets together into one network. We then use betweenness centrality to find bridge ingredients. Bridge ingredients link the part of the network and the Western part of the network. Bridge ingredients have a role in mixing Asian and Western cooking. Next we run the Louvain algorithm to find ingredient communities. Ingredient communities group ingredients. Ingredient communities form flavor clusters or new mixed groups. The findings show how network science can show cultural patterns in everyday cooking. The findings also point out the ingredients that help cooking exchange, between Western traditions. The result is clear.</w:t>
+        <w:t xml:space="preserve">Understanding how different culinary traditions organize and combine ingredients gives us a view of identity and global food practices. In this study we build ingredient co‑occurrence networks from an available Kaggle dataset to look at patterns in Asian cuisine and Western cuisine. In the ingredient co‑occurrence networks each node is an ingredient and each weighted edge shows that the ingredient co‑occurs with another ingredient in a recipe. </w:t>
+      </w:r>
+      <w:proofErr w:type="gramStart"/>
+      <w:r>
+        <w:rPr>
+          <w:rFonts w:ascii="Times New Roman" w:hAnsi="Times New Roman" w:cs="Times New Roman"/>
+          <w:sz w:val="24"/>
+        </w:rPr>
+        <w:t>First</w:t>
+      </w:r>
+      <w:proofErr w:type="gramEnd"/>
+      <w:r>
+        <w:rPr>
+          <w:rFonts w:ascii="Times New Roman" w:hAnsi="Times New Roman" w:cs="Times New Roman"/>
+          <w:sz w:val="24"/>
+        </w:rPr>
+        <w:t xml:space="preserve"> we compare the two cuisine groups by looking at network size, network density and centrality distributions. Then we point out core ingredients that act as backbones, in each culinary system. We first put the two data sets together into one network. We then use betweenness centrality to find bridge ingredients. Bridge ingredients link the part of the network and the Western part of the network. Bridge ingredients have a role in mixing Asian and Western cooking. </w:t>
+      </w:r>
+      <w:proofErr w:type="gramStart"/>
+      <w:r>
+        <w:rPr>
+          <w:rFonts w:ascii="Times New Roman" w:hAnsi="Times New Roman" w:cs="Times New Roman"/>
+          <w:sz w:val="24"/>
+        </w:rPr>
+        <w:t>Next</w:t>
+      </w:r>
+      <w:proofErr w:type="gramEnd"/>
+      <w:r>
+        <w:rPr>
+          <w:rFonts w:ascii="Times New Roman" w:hAnsi="Times New Roman" w:cs="Times New Roman"/>
+          <w:sz w:val="24"/>
+        </w:rPr>
+        <w:t xml:space="preserve"> we run the Louvain algorithm to find ingredient communities. Ingredient communities group ingredients. Ingredient communities form flavor clusters or new mixed groups. The findings show how network science can show cultural patterns in everyday cooking. The findings also point out the ingredients that help cooking exchange, between Western traditions. The result is clear.</w:t>
       </w:r>
     </w:p>
     <w:p>
@@ -167,15 +274,8 @@
           <w:rFonts w:ascii="Times New Roman" w:hAnsi="Times New Roman" w:cs="Times New Roman"/>
           <w:sz w:val="24"/>
         </w:rPr>
-        <w:t xml:space="preserve">I have read that the Flavor Network by Ahn et al. (2011) Shows that ingredients can be </w:t>
-      </w:r>
-      <w:r>
-        <w:rPr>
-          <w:rFonts w:ascii="Times New Roman" w:hAnsi="Times New Roman" w:cs="Times New Roman"/>
-          <w:sz w:val="24"/>
-        </w:rPr>
         <w:lastRenderedPageBreak/>
-        <w:t>treated as nodes that share flavor compounds. The network shows patterns in how recipes are built. Later studies built on this idea. Later studies looked at how ingredients appear in recipes. Later studies created recommendation tools. Later studies examined cuisines one by one. Ingredient networks capture cultural information about food. Earlier studies look at only one regional cuisine or only, at worldwide patterns. Earlier studies do not compare the major culinary groups.</w:t>
+        <w:t>I have read that the Flavor Network by Ahn et al. (2011) Shows that ingredients can be treated as nodes that share flavor compounds. The network shows patterns in how recipes are built. Later studies built on this idea. Later studies looked at how ingredients appear in recipes. Later studies created recommendation tools. Later studies examined cuisines one by one. Ingredient networks capture cultural information about food. Earlier studies look at only one regional cuisine or only, at worldwide patterns. Earlier studies do not compare the major culinary groups.</w:t>
       </w:r>
       <w:r>
         <w:rPr>
@@ -411,8 +511,17 @@
           <w:rFonts w:ascii="Times New Roman" w:hAnsi="Times New Roman" w:cs="Times New Roman"/>
           <w:sz w:val="24"/>
         </w:rPr>
-        <w:t>then identify the core ingredients—nodes, with degree or high eigenvector centrality that serve as the backbones of the ingredient co‑occurrence networks. The core ingredients are the hubs. Next</w:t>
-      </w:r>
+        <w:t xml:space="preserve">then identify the core ingredients—nodes, with degree or high eigenvector centrality that serve as the backbones of the ingredient co‑occurrence networks. The core ingredients are the hubs. </w:t>
+      </w:r>
+      <w:proofErr w:type="gramStart"/>
+      <w:r>
+        <w:rPr>
+          <w:rFonts w:ascii="Times New Roman" w:hAnsi="Times New Roman" w:cs="Times New Roman"/>
+          <w:sz w:val="24"/>
+        </w:rPr>
+        <w:t>Next</w:t>
+      </w:r>
+      <w:proofErr w:type="gramEnd"/>
       <w:r>
         <w:rPr>
           <w:rFonts w:ascii="Times New Roman" w:hAnsi="Times New Roman" w:cs="Times New Roman" w:hint="eastAsia"/>
@@ -439,7 +548,23 @@
           <w:rFonts w:ascii="Times New Roman" w:hAnsi="Times New Roman" w:cs="Times New Roman"/>
           <w:sz w:val="24"/>
         </w:rPr>
-        <w:t>use centrality to detect the bridge ingredients that connect the Asian‑dominated region of the global network to the Western‑dominated region of the global network. The bridge ingredients link the two sides. Finally we use the Louvain community detection method to find the ingredient communities. The ingredient communities can be flavor clusters or emerging fusion groups.</w:t>
+        <w:t xml:space="preserve">use centrality to detect the bridge ingredients that connect the Asian‑dominated region of the global network to the Western‑dominated region of the global network. The bridge ingredients link the two sides. </w:t>
+      </w:r>
+      <w:proofErr w:type="gramStart"/>
+      <w:r>
+        <w:rPr>
+          <w:rFonts w:ascii="Times New Roman" w:hAnsi="Times New Roman" w:cs="Times New Roman"/>
+          <w:sz w:val="24"/>
+        </w:rPr>
+        <w:t>Finally</w:t>
+      </w:r>
+      <w:proofErr w:type="gramEnd"/>
+      <w:r>
+        <w:rPr>
+          <w:rFonts w:ascii="Times New Roman" w:hAnsi="Times New Roman" w:cs="Times New Roman"/>
+          <w:sz w:val="24"/>
+        </w:rPr>
+        <w:t xml:space="preserve"> we use the Louvain community detection method to find the ingredient communities. The ingredient communities can be flavor clusters or emerging fusion groups.</w:t>
       </w:r>
     </w:p>
     <w:p>
@@ -496,6 +621,7 @@
           <w:iCs/>
           <w:sz w:val="24"/>
         </w:rPr>
+        <w:lastRenderedPageBreak/>
         <w:t>How do Asian and Western cuisines differ in network structure?</w:t>
       </w:r>
     </w:p>
@@ -517,7 +643,6 @@
           <w:iCs/>
           <w:sz w:val="24"/>
         </w:rPr>
-        <w:lastRenderedPageBreak/>
         <w:t>Which ingredients act as bridges that connect the two culinary systems?</w:t>
       </w:r>
     </w:p>
@@ -554,7 +679,23 @@
           <w:rFonts w:ascii="Times New Roman" w:hAnsi="Times New Roman" w:cs="Times New Roman"/>
           <w:sz w:val="24"/>
         </w:rPr>
-        <w:t>The study looks at these questions. The study provides a network science view of cooking habits from cultures and provides a data based look, at how Asian cuisines and Western cuisines are different but linked.</w:t>
+        <w:t xml:space="preserve">The study looks at these questions. The study provides a network science view of cooking habits from cultures and provides a </w:t>
+      </w:r>
+      <w:proofErr w:type="gramStart"/>
+      <w:r>
+        <w:rPr>
+          <w:rFonts w:ascii="Times New Roman" w:hAnsi="Times New Roman" w:cs="Times New Roman"/>
+          <w:sz w:val="24"/>
+        </w:rPr>
+        <w:t>data based</w:t>
+      </w:r>
+      <w:proofErr w:type="gramEnd"/>
+      <w:r>
+        <w:rPr>
+          <w:rFonts w:ascii="Times New Roman" w:hAnsi="Times New Roman" w:cs="Times New Roman"/>
+          <w:sz w:val="24"/>
+        </w:rPr>
+        <w:t xml:space="preserve"> look, at how Asian cuisines and Western cuisines are different but linked.</w:t>
       </w:r>
     </w:p>
     <w:p>
@@ -757,7 +898,6 @@
           <w:sz w:val="24"/>
         </w:rPr>
         <w:br/>
-        <w:t xml:space="preserve">It compares Asian and Western cuisines directly by constructing ingredient co-occurrence </w:t>
       </w:r>
       <w:r>
         <w:rPr>
@@ -765,7 +905,7 @@
           <w:sz w:val="24"/>
         </w:rPr>
         <w:lastRenderedPageBreak/>
-        <w:t>networks for both groups. It identifies the core ingredients that serve as backbones in each network and finds the ingredients that act as bridges between the two systems. By applying community detection, this study also highlights how ingredients cluster into flavor groups, including possible fusion clusters.</w:t>
+        <w:t>It compares Asian and Western cuisines directly by constructing ingredient co-occurrence networks for both groups. It identifies the core ingredients that serve as backbones in each network and finds the ingredients that act as bridges between the two systems. By applying community detection, this study also highlights how ingredients cluster into flavor groups, including possible fusion clusters.</w:t>
       </w:r>
     </w:p>
     <w:p>
@@ -881,6 +1021,7 @@
         </w:rPr>
         <w:t xml:space="preserve"> that did not match either list </w:t>
       </w:r>
+      <w:proofErr w:type="gramStart"/>
       <w:r>
         <w:rPr>
           <w:rFonts w:ascii="Times New Roman" w:hAnsi="Times New Roman" w:cs="Times New Roman"/>
@@ -895,6 +1036,7 @@
         </w:rPr>
         <w:t>ere</w:t>
       </w:r>
+      <w:proofErr w:type="gramEnd"/>
       <w:r>
         <w:rPr>
           <w:rFonts w:ascii="Times New Roman" w:hAnsi="Times New Roman" w:cs="Times New Roman"/>
@@ -1009,7 +1151,7 @@
           <w:sz w:val="24"/>
         </w:rPr>
         <w:br/>
-        <w:t xml:space="preserve">For each network we calculated the number of nodes, the number of edges, the average degree, and the density. These measures give an overview of the network structure. For every </w:t>
+        <w:t xml:space="preserve">For each network we calculated the number of nodes, the number of edges, the average </w:t>
       </w:r>
       <w:r>
         <w:rPr>
@@ -1017,7 +1159,7 @@
           <w:sz w:val="24"/>
         </w:rPr>
         <w:lastRenderedPageBreak/>
-        <w:t>ingredient we computed the degree, the betweenness centrality, and the eigenvector centrality. Degree measures how many neighbors an ingredient has. Betweenness shows how often an ingredient lies on the shortest path between other ingredients. Eigenvector centrality identifies ingredients that connect to other important ingredients.</w:t>
+        <w:t>degree, and the density. These measures give an overview of the network structure. For every ingredient we computed the degree, the betweenness centrality, and the eigenvector centrality. Degree measures how many neighbors an ingredient has. Betweenness shows how often an ingredient lies on the shortest path between other ingredients. Eigenvector centrality identifies ingredients that connect to other important ingredients.</w:t>
       </w:r>
     </w:p>
     <w:p>
@@ -1054,6 +1196,34 @@
       <w:pPr>
         <w:rPr>
           <w:rFonts w:ascii="Times New Roman" w:hAnsi="Times New Roman" w:cs="Times New Roman"/>
+          <w:sz w:val="24"/>
+        </w:rPr>
+      </w:pPr>
+      <w:r>
+        <w:rPr>
+          <w:rFonts w:ascii="Times New Roman" w:hAnsi="Times New Roman" w:cs="Times New Roman"/>
+          <w:sz w:val="24"/>
+        </w:rPr>
+        <w:t>Project Repository:</w:t>
+      </w:r>
+      <w:r>
+        <w:t xml:space="preserve"> </w:t>
+      </w:r>
+      <w:hyperlink r:id="rId8" w:history="1">
+        <w:r>
+          <w:rPr>
+            <w:rStyle w:val="af2"/>
+            <w:rFonts w:ascii="Times New Roman" w:hAnsi="Times New Roman" w:cs="Times New Roman"/>
+            <w:sz w:val="24"/>
+          </w:rPr>
+          <w:t>https://github.com/SerenaChen7/COSC421_2025W1</w:t>
+        </w:r>
+      </w:hyperlink>
+    </w:p>
+    <w:p>
+      <w:pPr>
+        <w:rPr>
+          <w:rFonts w:ascii="Times New Roman" w:hAnsi="Times New Roman" w:cs="Times New Roman" w:hint="eastAsia"/>
           <w:sz w:val="24"/>
         </w:rPr>
       </w:pPr>
@@ -1196,85 +1366,732 @@
           <w:rFonts w:ascii="Times New Roman" w:hAnsi="Times New Roman" w:cs="Times New Roman"/>
           <w:sz w:val="24"/>
         </w:rPr>
+        <w:lastRenderedPageBreak/>
         <w:t>Centrality measures were computed for each network.</w:t>
       </w:r>
-      <w:r>
-        <w:rPr>
-          <w:rFonts w:ascii="Times New Roman" w:hAnsi="Times New Roman" w:cs="Times New Roman"/>
-          <w:sz w:val="24"/>
-        </w:rPr>
-        <w:br/>
-        <w:t xml:space="preserve">In the Asian network, the top ingredients by degree include salt, sunflower oil, coriander </w:t>
-      </w:r>
+    </w:p>
+    <w:p>
+      <w:pPr>
+        <w:rPr>
+          <w:rFonts w:ascii="Times New Roman" w:hAnsi="Times New Roman" w:cs="Times New Roman"/>
+          <w:sz w:val="24"/>
+        </w:rPr>
+      </w:pPr>
+      <w:r>
+        <w:rPr>
+          <w:noProof/>
+        </w:rPr>
+        <w:drawing>
+          <wp:inline distT="0" distB="0" distL="0" distR="0" wp14:anchorId="5BB3BE48" wp14:editId="77ABDD43">
+            <wp:extent cx="4672580" cy="3140765"/>
+            <wp:effectExtent l="0" t="0" r="0" b="2540"/>
+            <wp:docPr id="1" name="图片 1"/>
+            <wp:cNvGraphicFramePr>
+              <a:graphicFrameLocks xmlns:a="http://schemas.openxmlformats.org/drawingml/2006/main" noChangeAspect="1"/>
+            </wp:cNvGraphicFramePr>
+            <a:graphic xmlns:a="http://schemas.openxmlformats.org/drawingml/2006/main">
+              <a:graphicData uri="http://schemas.openxmlformats.org/drawingml/2006/picture">
+                <pic:pic xmlns:pic="http://schemas.openxmlformats.org/drawingml/2006/picture">
+                  <pic:nvPicPr>
+                    <pic:cNvPr id="1" name=""/>
+                    <pic:cNvPicPr/>
+                  </pic:nvPicPr>
+                  <pic:blipFill>
+                    <a:blip r:embed="rId9"/>
+                    <a:stretch>
+                      <a:fillRect/>
+                    </a:stretch>
+                  </pic:blipFill>
+                  <pic:spPr>
+                    <a:xfrm>
+                      <a:off x="0" y="0"/>
+                      <a:ext cx="4694315" cy="3155375"/>
+                    </a:xfrm>
+                    <a:prstGeom prst="rect">
+                      <a:avLst/>
+                    </a:prstGeom>
+                  </pic:spPr>
+                </pic:pic>
+              </a:graphicData>
+            </a:graphic>
+          </wp:inline>
+        </w:drawing>
+      </w:r>
+    </w:p>
+    <w:p>
+      <w:pPr>
+        <w:rPr>
+          <w:rFonts w:ascii="Times New Roman" w:hAnsi="Times New Roman" w:cs="Times New Roman"/>
+          <w:sz w:val="24"/>
+        </w:rPr>
+      </w:pPr>
+      <w:r>
+        <w:rPr>
+          <w:rFonts w:ascii="Times New Roman" w:hAnsi="Times New Roman" w:cs="Times New Roman"/>
+          <w:i/>
+          <w:iCs/>
+          <w:sz w:val="24"/>
+        </w:rPr>
+        <w:t xml:space="preserve">Figure </w:t>
+      </w:r>
+      <w:r>
+        <w:rPr>
+          <w:rFonts w:ascii="Times New Roman" w:hAnsi="Times New Roman" w:cs="Times New Roman" w:hint="eastAsia"/>
+          <w:i/>
+          <w:iCs/>
+          <w:sz w:val="24"/>
+        </w:rPr>
+        <w:t>1</w:t>
+      </w:r>
+      <w:r>
+        <w:rPr>
+          <w:rFonts w:ascii="Times New Roman" w:hAnsi="Times New Roman" w:cs="Times New Roman"/>
+          <w:i/>
+          <w:iCs/>
+          <w:sz w:val="24"/>
+        </w:rPr>
+        <w:t>. Asian ingredient co-occurrence subnetwork consisting of the top 200 highest-degree ingredients.</w:t>
+      </w:r>
+      <w:r>
+        <w:rPr>
+          <w:rFonts w:ascii="Times New Roman" w:hAnsi="Times New Roman" w:cs="Times New Roman" w:hint="eastAsia"/>
+          <w:i/>
+          <w:iCs/>
+          <w:sz w:val="24"/>
+        </w:rPr>
+        <w:t xml:space="preserve"> </w:t>
+      </w:r>
+      <w:r>
+        <w:rPr>
+          <w:rFonts w:ascii="Times New Roman" w:hAnsi="Times New Roman" w:cs="Times New Roman"/>
+          <w:i/>
+          <w:iCs/>
+          <w:sz w:val="24"/>
+        </w:rPr>
+        <w:t>(Node color represents degree centrality (darker = higher degree).</w:t>
+      </w:r>
+    </w:p>
+    <w:p>
+      <w:pPr>
+        <w:rPr>
+          <w:rFonts w:ascii="Times New Roman" w:hAnsi="Times New Roman" w:cs="Times New Roman"/>
+          <w:i/>
+          <w:iCs/>
+          <w:sz w:val="24"/>
+        </w:rPr>
+      </w:pPr>
+      <w:r>
+        <w:rPr>
+          <w:rFonts w:ascii="Times New Roman" w:hAnsi="Times New Roman" w:cs="Times New Roman"/>
+          <w:sz w:val="24"/>
+        </w:rPr>
+        <w:t xml:space="preserve">The node colors show degree centrality values through darker nodes which indicate higher degree centrality, and the network consists of two densely connected clusters which share multiple ingredients between them. In the Asian network, the top ingredients by degree include salt, sunflower oil, coriander leaves, garlic, ginger, turmeric powder, onion, red </w:t>
+      </w:r>
+      <w:proofErr w:type="spellStart"/>
+      <w:r>
+        <w:rPr>
+          <w:rFonts w:ascii="Times New Roman" w:hAnsi="Times New Roman" w:cs="Times New Roman"/>
+          <w:sz w:val="24"/>
+        </w:rPr>
+        <w:t>chilli</w:t>
+      </w:r>
+      <w:proofErr w:type="spellEnd"/>
+      <w:r>
+        <w:rPr>
+          <w:rFonts w:ascii="Times New Roman" w:hAnsi="Times New Roman" w:cs="Times New Roman"/>
+          <w:sz w:val="24"/>
+        </w:rPr>
+        <w:t xml:space="preserve"> powder, green </w:t>
+      </w:r>
+      <w:proofErr w:type="spellStart"/>
+      <w:r>
+        <w:rPr>
+          <w:rFonts w:ascii="Times New Roman" w:hAnsi="Times New Roman" w:cs="Times New Roman"/>
+          <w:sz w:val="24"/>
+        </w:rPr>
+        <w:t>chillies</w:t>
+      </w:r>
+      <w:proofErr w:type="spellEnd"/>
+      <w:r>
+        <w:rPr>
+          <w:rFonts w:ascii="Times New Roman" w:hAnsi="Times New Roman" w:cs="Times New Roman"/>
+          <w:sz w:val="24"/>
+        </w:rPr>
+        <w:t>, and water. Many of these ingredients are staples of Indian and Southeast Asian cooking.</w:t>
+      </w:r>
+      <w:r>
+        <w:rPr>
+          <w:noProof/>
+        </w:rPr>
+        <w:drawing>
+          <wp:inline distT="0" distB="0" distL="0" distR="0" wp14:anchorId="23681707" wp14:editId="082F27A1">
+            <wp:extent cx="4707172" cy="2919427"/>
+            <wp:effectExtent l="0" t="0" r="0" b="0"/>
+            <wp:docPr id="3" name="图片 3"/>
+            <wp:cNvGraphicFramePr>
+              <a:graphicFrameLocks xmlns:a="http://schemas.openxmlformats.org/drawingml/2006/main" noChangeAspect="1"/>
+            </wp:cNvGraphicFramePr>
+            <a:graphic xmlns:a="http://schemas.openxmlformats.org/drawingml/2006/main">
+              <a:graphicData uri="http://schemas.openxmlformats.org/drawingml/2006/picture">
+                <pic:pic xmlns:pic="http://schemas.openxmlformats.org/drawingml/2006/picture">
+                  <pic:nvPicPr>
+                    <pic:cNvPr id="1" name=""/>
+                    <pic:cNvPicPr/>
+                  </pic:nvPicPr>
+                  <pic:blipFill>
+                    <a:blip r:embed="rId10"/>
+                    <a:stretch>
+                      <a:fillRect/>
+                    </a:stretch>
+                  </pic:blipFill>
+                  <pic:spPr>
+                    <a:xfrm>
+                      <a:off x="0" y="0"/>
+                      <a:ext cx="4743541" cy="2941984"/>
+                    </a:xfrm>
+                    <a:prstGeom prst="rect">
+                      <a:avLst/>
+                    </a:prstGeom>
+                  </pic:spPr>
+                </pic:pic>
+              </a:graphicData>
+            </a:graphic>
+          </wp:inline>
+        </w:drawing>
+      </w:r>
+    </w:p>
+    <w:p>
+      <w:pPr>
+        <w:rPr>
+          <w:rFonts w:ascii="Times New Roman" w:hAnsi="Times New Roman" w:cs="Times New Roman"/>
+          <w:i/>
+          <w:iCs/>
+          <w:sz w:val="24"/>
+        </w:rPr>
+      </w:pPr>
+      <w:r>
+        <w:rPr>
+          <w:rFonts w:ascii="Times New Roman" w:hAnsi="Times New Roman" w:cs="Times New Roman"/>
+          <w:i/>
+          <w:iCs/>
+          <w:sz w:val="24"/>
+        </w:rPr>
+        <w:t xml:space="preserve">Figure </w:t>
+      </w:r>
+      <w:r>
+        <w:rPr>
+          <w:rFonts w:ascii="Times New Roman" w:hAnsi="Times New Roman" w:cs="Times New Roman" w:hint="eastAsia"/>
+          <w:i/>
+          <w:iCs/>
+          <w:sz w:val="24"/>
+        </w:rPr>
+        <w:t>2</w:t>
+      </w:r>
+      <w:r>
+        <w:rPr>
+          <w:rFonts w:ascii="Times New Roman" w:hAnsi="Times New Roman" w:cs="Times New Roman"/>
+          <w:i/>
+          <w:iCs/>
+          <w:sz w:val="24"/>
+        </w:rPr>
+        <w:t>. Western ingredient co-occurrence network (top 200 nodes).</w:t>
+      </w:r>
+    </w:p>
+    <w:p>
+      <w:pPr>
+        <w:rPr>
+          <w:rFonts w:ascii="Times New Roman" w:hAnsi="Times New Roman" w:cs="Times New Roman"/>
+          <w:sz w:val="24"/>
+        </w:rPr>
+      </w:pPr>
       <w:r>
         <w:rPr>
           <w:rFonts w:ascii="Times New Roman" w:hAnsi="Times New Roman" w:cs="Times New Roman"/>
           <w:sz w:val="24"/>
         </w:rPr>
         <w:lastRenderedPageBreak/>
-        <w:t xml:space="preserve">leaves, garlic, ginger, turmeric powder, onion, red </w:t>
-      </w:r>
-      <w:proofErr w:type="spellStart"/>
-      <w:r>
-        <w:rPr>
-          <w:rFonts w:ascii="Times New Roman" w:hAnsi="Times New Roman" w:cs="Times New Roman"/>
-          <w:sz w:val="24"/>
-        </w:rPr>
-        <w:t>chilli</w:t>
-      </w:r>
-      <w:proofErr w:type="spellEnd"/>
-      <w:r>
-        <w:rPr>
-          <w:rFonts w:ascii="Times New Roman" w:hAnsi="Times New Roman" w:cs="Times New Roman"/>
-          <w:sz w:val="24"/>
-        </w:rPr>
-        <w:t xml:space="preserve"> powder, green </w:t>
-      </w:r>
-      <w:proofErr w:type="spellStart"/>
-      <w:r>
-        <w:rPr>
-          <w:rFonts w:ascii="Times New Roman" w:hAnsi="Times New Roman" w:cs="Times New Roman"/>
-          <w:sz w:val="24"/>
-        </w:rPr>
-        <w:t>chillies</w:t>
-      </w:r>
-      <w:proofErr w:type="spellEnd"/>
-      <w:r>
-        <w:rPr>
-          <w:rFonts w:ascii="Times New Roman" w:hAnsi="Times New Roman" w:cs="Times New Roman"/>
-          <w:sz w:val="24"/>
-        </w:rPr>
-        <w:t>, and water. Many of these ingredients are staples of Indian and Southeast Asian cooking.</w:t>
-      </w:r>
-    </w:p>
-    <w:p>
-      <w:pPr>
-        <w:rPr>
-          <w:rFonts w:ascii="Times New Roman" w:hAnsi="Times New Roman" w:cs="Times New Roman"/>
-          <w:sz w:val="24"/>
-        </w:rPr>
-      </w:pPr>
-      <w:r>
-        <w:rPr>
-          <w:rFonts w:ascii="Times New Roman" w:hAnsi="Times New Roman" w:cs="Times New Roman"/>
-          <w:sz w:val="24"/>
-        </w:rPr>
-        <w:t>In the Western network, the highest-degree ingredients include salt, extra virgin olive oil, lemon juice, garlic, sugar, onion, black pepper powder, milk, all-purpose flour, and salt and pepper. These ingredients reflect Western flavor bases and baking practices.</w:t>
-      </w:r>
-    </w:p>
-    <w:p>
-      <w:pPr>
-        <w:rPr>
-          <w:rFonts w:ascii="Times New Roman" w:hAnsi="Times New Roman" w:cs="Times New Roman"/>
-          <w:sz w:val="24"/>
-        </w:rPr>
-      </w:pPr>
-      <w:r>
-        <w:rPr>
-          <w:rFonts w:ascii="Times New Roman" w:hAnsi="Times New Roman" w:cs="Times New Roman"/>
-          <w:sz w:val="24"/>
-        </w:rPr>
-        <w:t>In the global network, the most central ingredients combine patterns from both groups. The highest-degree ingredients include salt, garlic, sunflower oil, onion, coriander leaves, sugar, water, ginger, lemon juice, and turmeric powder. These ingredients appear frequently across multiple cuisines and form the backbone of the global network.</w:t>
+        <w:t xml:space="preserve">In the Western network, </w:t>
+      </w:r>
+      <w:r>
+        <w:rPr>
+          <w:rFonts w:ascii="Times New Roman" w:hAnsi="Times New Roman" w:cs="Times New Roman"/>
+          <w:sz w:val="24"/>
+        </w:rPr>
+        <w:t xml:space="preserve">the </w:t>
+      </w:r>
+      <w:r>
+        <w:rPr>
+          <w:rFonts w:ascii="Times New Roman" w:hAnsi="Times New Roman" w:cs="Times New Roman"/>
+          <w:sz w:val="24"/>
+        </w:rPr>
+        <w:t>subgraph shows a single dense core with a small detached cluster because it represents a centralized ingredient structure which is characteristic of Western cuisine. The color scheme indicates degree centrality through darker node colors which represent higher degree values.</w:t>
+      </w:r>
+      <w:r>
+        <w:rPr>
+          <w:rFonts w:ascii="Times New Roman" w:hAnsi="Times New Roman" w:cs="Times New Roman"/>
+          <w:sz w:val="24"/>
+        </w:rPr>
+        <w:t xml:space="preserve"> T</w:t>
+      </w:r>
+      <w:r>
+        <w:rPr>
+          <w:rFonts w:ascii="Times New Roman" w:hAnsi="Times New Roman" w:cs="Times New Roman"/>
+          <w:sz w:val="24"/>
+        </w:rPr>
+        <w:t>he highest-degree ingredients include salt, extra virgin olive oil, lemon juice, garlic, sugar, onion, black pepper powder, milk, all-purpose flour, and salt and pepper. These ingredients reflect Western flavor bases and baking practices.</w:t>
+      </w:r>
+    </w:p>
+    <w:p>
+      <w:pPr>
+        <w:rPr>
+          <w:rFonts w:ascii="Times New Roman" w:hAnsi="Times New Roman" w:cs="Times New Roman"/>
+          <w:sz w:val="24"/>
+        </w:rPr>
+      </w:pPr>
+      <w:r>
+        <w:rPr>
+          <w:noProof/>
+        </w:rPr>
+        <w:drawing>
+          <wp:inline distT="0" distB="0" distL="0" distR="0" wp14:anchorId="573426CF" wp14:editId="7D407D17">
+            <wp:extent cx="4691270" cy="3090958"/>
+            <wp:effectExtent l="0" t="0" r="0" b="0"/>
+            <wp:docPr id="4" name="图片 4"/>
+            <wp:cNvGraphicFramePr>
+              <a:graphicFrameLocks xmlns:a="http://schemas.openxmlformats.org/drawingml/2006/main" noChangeAspect="1"/>
+            </wp:cNvGraphicFramePr>
+            <a:graphic xmlns:a="http://schemas.openxmlformats.org/drawingml/2006/main">
+              <a:graphicData uri="http://schemas.openxmlformats.org/drawingml/2006/picture">
+                <pic:pic xmlns:pic="http://schemas.openxmlformats.org/drawingml/2006/picture">
+                  <pic:nvPicPr>
+                    <pic:cNvPr id="1" name=""/>
+                    <pic:cNvPicPr/>
+                  </pic:nvPicPr>
+                  <pic:blipFill>
+                    <a:blip r:embed="rId11"/>
+                    <a:stretch>
+                      <a:fillRect/>
+                    </a:stretch>
+                  </pic:blipFill>
+                  <pic:spPr>
+                    <a:xfrm>
+                      <a:off x="0" y="0"/>
+                      <a:ext cx="4697829" cy="3095280"/>
+                    </a:xfrm>
+                    <a:prstGeom prst="rect">
+                      <a:avLst/>
+                    </a:prstGeom>
+                  </pic:spPr>
+                </pic:pic>
+              </a:graphicData>
+            </a:graphic>
+          </wp:inline>
+        </w:drawing>
+      </w:r>
+    </w:p>
+    <w:p>
+      <w:pPr>
+        <w:rPr>
+          <w:rFonts w:ascii="Times New Roman" w:hAnsi="Times New Roman" w:cs="Times New Roman"/>
+          <w:i/>
+          <w:iCs/>
+          <w:sz w:val="24"/>
+        </w:rPr>
+      </w:pPr>
+      <w:r>
+        <w:rPr>
+          <w:rFonts w:ascii="Times New Roman" w:hAnsi="Times New Roman" w:cs="Times New Roman"/>
+          <w:i/>
+          <w:iCs/>
+          <w:sz w:val="24"/>
+        </w:rPr>
+        <w:t xml:space="preserve">Figure </w:t>
+      </w:r>
+      <w:r>
+        <w:rPr>
+          <w:rFonts w:ascii="Times New Roman" w:hAnsi="Times New Roman" w:cs="Times New Roman" w:hint="eastAsia"/>
+          <w:i/>
+          <w:iCs/>
+          <w:sz w:val="24"/>
+        </w:rPr>
+        <w:t>3</w:t>
+      </w:r>
+      <w:r>
+        <w:rPr>
+          <w:rFonts w:ascii="Times New Roman" w:hAnsi="Times New Roman" w:cs="Times New Roman"/>
+          <w:i/>
+          <w:iCs/>
+          <w:sz w:val="24"/>
+        </w:rPr>
+        <w:t>. Global ingredient co-occurrence network showing the top 300 highest-degree ingredients, colored by Louvain communities.</w:t>
+      </w:r>
+    </w:p>
+    <w:p>
+      <w:pPr>
+        <w:rPr>
+          <w:rFonts w:ascii="Times New Roman" w:hAnsi="Times New Roman" w:cs="Times New Roman"/>
+          <w:sz w:val="24"/>
+        </w:rPr>
+      </w:pPr>
+      <w:r>
+        <w:rPr>
+          <w:rFonts w:ascii="Times New Roman" w:hAnsi="Times New Roman" w:cs="Times New Roman"/>
+          <w:sz w:val="24"/>
+        </w:rPr>
+        <w:t xml:space="preserve">In the global network, the most central ingredients combine patterns from both groups. </w:t>
+      </w:r>
+      <w:r>
+        <w:rPr>
+          <w:rFonts w:ascii="Times New Roman" w:hAnsi="Times New Roman" w:cs="Times New Roman"/>
+          <w:sz w:val="24"/>
+        </w:rPr>
+        <w:t xml:space="preserve">The </w:t>
+      </w:r>
+      <w:r>
+        <w:rPr>
+          <w:rFonts w:ascii="Times New Roman" w:hAnsi="Times New Roman" w:cs="Times New Roman" w:hint="eastAsia"/>
+          <w:sz w:val="24"/>
+        </w:rPr>
+        <w:t>figure above</w:t>
+      </w:r>
+      <w:r>
+        <w:rPr>
+          <w:rFonts w:ascii="Times New Roman" w:hAnsi="Times New Roman" w:cs="Times New Roman"/>
+          <w:sz w:val="24"/>
+        </w:rPr>
+        <w:t xml:space="preserve"> shows two distinct clusters which consist of a Western-dominated community (blue) and an Asian-dominated community (green/red). The bridge ingredients which appear in both cuisine groups form cross-cluster edges that connect these regions. The Asian community displays nodes with red and green colors which shows that new fusion patterns are developing.</w:t>
+      </w:r>
+      <w:r>
+        <w:rPr>
+          <w:rFonts w:ascii="Times New Roman" w:hAnsi="Times New Roman" w:cs="Times New Roman" w:hint="eastAsia"/>
+          <w:sz w:val="24"/>
+        </w:rPr>
+        <w:t xml:space="preserve"> </w:t>
+      </w:r>
+      <w:r>
+        <w:rPr>
+          <w:rFonts w:ascii="Times New Roman" w:hAnsi="Times New Roman" w:cs="Times New Roman"/>
+          <w:sz w:val="24"/>
+        </w:rPr>
+        <w:t>The highest-degree ingredients include salt, garlic, sunflower oil, onion, coriander leaves, sugar, water, ginger, lemon juice, and turmeric powder. These ingredients appear frequently across multiple cuisines and form the backbone of the global network.</w:t>
+      </w:r>
+    </w:p>
+    <w:p>
+      <w:pPr>
+        <w:rPr>
+          <w:rFonts w:ascii="Times New Roman" w:hAnsi="Times New Roman" w:cs="Times New Roman"/>
+          <w:sz w:val="24"/>
+        </w:rPr>
+      </w:pPr>
+      <w:r>
+        <w:rPr>
+          <w:noProof/>
+        </w:rPr>
+        <w:lastRenderedPageBreak/>
+        <w:drawing>
+          <wp:inline distT="0" distB="0" distL="0" distR="0" wp14:anchorId="17AF9009" wp14:editId="6736FF5B">
+            <wp:extent cx="5498641" cy="3514476"/>
+            <wp:effectExtent l="0" t="0" r="6985" b="0"/>
+            <wp:docPr id="5" name="图片 5"/>
+            <wp:cNvGraphicFramePr>
+              <a:graphicFrameLocks xmlns:a="http://schemas.openxmlformats.org/drawingml/2006/main" noChangeAspect="1"/>
+            </wp:cNvGraphicFramePr>
+            <a:graphic xmlns:a="http://schemas.openxmlformats.org/drawingml/2006/main">
+              <a:graphicData uri="http://schemas.openxmlformats.org/drawingml/2006/picture">
+                <pic:pic xmlns:pic="http://schemas.openxmlformats.org/drawingml/2006/picture">
+                  <pic:nvPicPr>
+                    <pic:cNvPr id="1" name=""/>
+                    <pic:cNvPicPr/>
+                  </pic:nvPicPr>
+                  <pic:blipFill>
+                    <a:blip r:embed="rId12"/>
+                    <a:stretch>
+                      <a:fillRect/>
+                    </a:stretch>
+                  </pic:blipFill>
+                  <pic:spPr>
+                    <a:xfrm>
+                      <a:off x="0" y="0"/>
+                      <a:ext cx="5506823" cy="3519706"/>
+                    </a:xfrm>
+                    <a:prstGeom prst="rect">
+                      <a:avLst/>
+                    </a:prstGeom>
+                  </pic:spPr>
+                </pic:pic>
+              </a:graphicData>
+            </a:graphic>
+          </wp:inline>
+        </w:drawing>
+      </w:r>
+    </w:p>
+    <w:p>
+      <w:pPr>
+        <w:rPr>
+          <w:rFonts w:ascii="Times New Roman" w:hAnsi="Times New Roman" w:cs="Times New Roman"/>
+          <w:i/>
+          <w:iCs/>
+          <w:sz w:val="24"/>
+        </w:rPr>
+      </w:pPr>
+      <w:r>
+        <w:rPr>
+          <w:rFonts w:ascii="Times New Roman" w:hAnsi="Times New Roman" w:cs="Times New Roman"/>
+          <w:i/>
+          <w:iCs/>
+          <w:sz w:val="24"/>
+        </w:rPr>
+        <w:t xml:space="preserve">Figure </w:t>
+      </w:r>
+      <w:r>
+        <w:rPr>
+          <w:rFonts w:ascii="Times New Roman" w:hAnsi="Times New Roman" w:cs="Times New Roman" w:hint="eastAsia"/>
+          <w:i/>
+          <w:iCs/>
+          <w:sz w:val="24"/>
+        </w:rPr>
+        <w:t>4</w:t>
+      </w:r>
+      <w:r>
+        <w:rPr>
+          <w:rFonts w:ascii="Times New Roman" w:hAnsi="Times New Roman" w:cs="Times New Roman"/>
+          <w:i/>
+          <w:iCs/>
+          <w:sz w:val="24"/>
+        </w:rPr>
+        <w:t>. Degree distribution of the global ingredient co-occurrence network.</w:t>
+      </w:r>
+    </w:p>
+    <w:p>
+      <w:pPr>
+        <w:rPr>
+          <w:rFonts w:ascii="Times New Roman" w:hAnsi="Times New Roman" w:cs="Times New Roman"/>
+          <w:sz w:val="24"/>
+        </w:rPr>
+      </w:pPr>
+      <w:r>
+        <w:rPr>
+          <w:rFonts w:ascii="Times New Roman" w:hAnsi="Times New Roman" w:cs="Times New Roman"/>
+          <w:sz w:val="24"/>
+        </w:rPr>
+        <w:t>The distribution is heavily right-skewed, indicating that most ingredients have very low degree, while a small number of highly common ingredients act as hubs.</w:t>
+      </w:r>
+    </w:p>
+    <w:p>
+      <w:pPr>
+        <w:rPr>
+          <w:rFonts w:ascii="Times New Roman" w:hAnsi="Times New Roman" w:cs="Times New Roman"/>
+          <w:sz w:val="24"/>
+        </w:rPr>
+      </w:pPr>
+    </w:p>
+    <w:p>
+      <w:pPr>
+        <w:rPr>
+          <w:rFonts w:ascii="Times New Roman" w:hAnsi="Times New Roman" w:cs="Times New Roman"/>
+          <w:sz w:val="24"/>
+        </w:rPr>
+      </w:pPr>
+      <w:r>
+        <w:rPr>
+          <w:noProof/>
+        </w:rPr>
+        <w:drawing>
+          <wp:inline distT="0" distB="0" distL="0" distR="0" wp14:anchorId="17B603AA" wp14:editId="060B18E2">
+            <wp:extent cx="5478449" cy="3751032"/>
+            <wp:effectExtent l="0" t="0" r="8255" b="1905"/>
+            <wp:docPr id="6" name="图片 6"/>
+            <wp:cNvGraphicFramePr>
+              <a:graphicFrameLocks xmlns:a="http://schemas.openxmlformats.org/drawingml/2006/main" noChangeAspect="1"/>
+            </wp:cNvGraphicFramePr>
+            <a:graphic xmlns:a="http://schemas.openxmlformats.org/drawingml/2006/main">
+              <a:graphicData uri="http://schemas.openxmlformats.org/drawingml/2006/picture">
+                <pic:pic xmlns:pic="http://schemas.openxmlformats.org/drawingml/2006/picture">
+                  <pic:nvPicPr>
+                    <pic:cNvPr id="1" name=""/>
+                    <pic:cNvPicPr/>
+                  </pic:nvPicPr>
+                  <pic:blipFill>
+                    <a:blip r:embed="rId13"/>
+                    <a:stretch>
+                      <a:fillRect/>
+                    </a:stretch>
+                  </pic:blipFill>
+                  <pic:spPr>
+                    <a:xfrm>
+                      <a:off x="0" y="0"/>
+                      <a:ext cx="5483603" cy="3754561"/>
+                    </a:xfrm>
+                    <a:prstGeom prst="rect">
+                      <a:avLst/>
+                    </a:prstGeom>
+                  </pic:spPr>
+                </pic:pic>
+              </a:graphicData>
+            </a:graphic>
+          </wp:inline>
+        </w:drawing>
+      </w:r>
+    </w:p>
+    <w:p>
+      <w:pPr>
+        <w:rPr>
+          <w:rFonts w:ascii="Times New Roman" w:hAnsi="Times New Roman" w:cs="Times New Roman"/>
+          <w:i/>
+          <w:iCs/>
+          <w:sz w:val="24"/>
+        </w:rPr>
+      </w:pPr>
+      <w:r>
+        <w:rPr>
+          <w:rFonts w:ascii="Times New Roman" w:hAnsi="Times New Roman" w:cs="Times New Roman"/>
+          <w:i/>
+          <w:iCs/>
+          <w:sz w:val="24"/>
+        </w:rPr>
+        <w:lastRenderedPageBreak/>
+        <w:t xml:space="preserve">Figure </w:t>
+      </w:r>
+      <w:r>
+        <w:rPr>
+          <w:rFonts w:ascii="Times New Roman" w:hAnsi="Times New Roman" w:cs="Times New Roman" w:hint="eastAsia"/>
+          <w:i/>
+          <w:iCs/>
+          <w:sz w:val="24"/>
+        </w:rPr>
+        <w:t>5</w:t>
+      </w:r>
+      <w:r>
+        <w:rPr>
+          <w:rFonts w:ascii="Times New Roman" w:hAnsi="Times New Roman" w:cs="Times New Roman"/>
+          <w:i/>
+          <w:iCs/>
+          <w:sz w:val="24"/>
+        </w:rPr>
+        <w:t xml:space="preserve">. Top 15 ingredients ranked by degree in the global co-occurrence network. </w:t>
+      </w:r>
+    </w:p>
+    <w:p>
+      <w:pPr>
+        <w:rPr>
+          <w:rFonts w:ascii="Times New Roman" w:hAnsi="Times New Roman" w:cs="Times New Roman"/>
+          <w:sz w:val="24"/>
+        </w:rPr>
+      </w:pPr>
+      <w:r>
+        <w:rPr>
+          <w:rFonts w:ascii="Times New Roman" w:hAnsi="Times New Roman" w:cs="Times New Roman"/>
+          <w:sz w:val="24"/>
+        </w:rPr>
+        <w:t>These ingredients appear across a wide range of recipes and serve as high-connectivity hubs in the global network.</w:t>
+      </w:r>
+    </w:p>
+    <w:p>
+      <w:pPr>
+        <w:rPr>
+          <w:rFonts w:ascii="Times New Roman" w:hAnsi="Times New Roman" w:cs="Times New Roman"/>
+          <w:sz w:val="24"/>
+        </w:rPr>
+      </w:pPr>
+    </w:p>
+    <w:p>
+      <w:pPr>
+        <w:rPr>
+          <w:rFonts w:ascii="Times New Roman" w:hAnsi="Times New Roman" w:cs="Times New Roman"/>
+          <w:sz w:val="24"/>
+        </w:rPr>
+      </w:pPr>
+      <w:r>
+        <w:rPr>
+          <w:noProof/>
+        </w:rPr>
+        <w:drawing>
+          <wp:inline distT="0" distB="0" distL="0" distR="0" wp14:anchorId="4996AFCB" wp14:editId="7EEF53D9">
+            <wp:extent cx="5454595" cy="3756455"/>
+            <wp:effectExtent l="0" t="0" r="0" b="0"/>
+            <wp:docPr id="7" name="图片 7"/>
+            <wp:cNvGraphicFramePr>
+              <a:graphicFrameLocks xmlns:a="http://schemas.openxmlformats.org/drawingml/2006/main" noChangeAspect="1"/>
+            </wp:cNvGraphicFramePr>
+            <a:graphic xmlns:a="http://schemas.openxmlformats.org/drawingml/2006/main">
+              <a:graphicData uri="http://schemas.openxmlformats.org/drawingml/2006/picture">
+                <pic:pic xmlns:pic="http://schemas.openxmlformats.org/drawingml/2006/picture">
+                  <pic:nvPicPr>
+                    <pic:cNvPr id="1" name=""/>
+                    <pic:cNvPicPr/>
+                  </pic:nvPicPr>
+                  <pic:blipFill>
+                    <a:blip r:embed="rId14"/>
+                    <a:stretch>
+                      <a:fillRect/>
+                    </a:stretch>
+                  </pic:blipFill>
+                  <pic:spPr>
+                    <a:xfrm>
+                      <a:off x="0" y="0"/>
+                      <a:ext cx="5465060" cy="3763662"/>
+                    </a:xfrm>
+                    <a:prstGeom prst="rect">
+                      <a:avLst/>
+                    </a:prstGeom>
+                  </pic:spPr>
+                </pic:pic>
+              </a:graphicData>
+            </a:graphic>
+          </wp:inline>
+        </w:drawing>
+      </w:r>
+    </w:p>
+    <w:p>
+      <w:pPr>
+        <w:rPr>
+          <w:rFonts w:ascii="Times New Roman" w:hAnsi="Times New Roman" w:cs="Times New Roman"/>
+          <w:i/>
+          <w:iCs/>
+          <w:sz w:val="24"/>
+        </w:rPr>
+      </w:pPr>
+      <w:r>
+        <w:rPr>
+          <w:rFonts w:ascii="Times New Roman" w:hAnsi="Times New Roman" w:cs="Times New Roman"/>
+          <w:i/>
+          <w:iCs/>
+          <w:sz w:val="24"/>
+        </w:rPr>
+        <w:t xml:space="preserve">Figure </w:t>
+      </w:r>
+      <w:r>
+        <w:rPr>
+          <w:rFonts w:ascii="Times New Roman" w:hAnsi="Times New Roman" w:cs="Times New Roman" w:hint="eastAsia"/>
+          <w:i/>
+          <w:iCs/>
+          <w:sz w:val="24"/>
+        </w:rPr>
+        <w:t>6</w:t>
+      </w:r>
+      <w:r>
+        <w:rPr>
+          <w:rFonts w:ascii="Times New Roman" w:hAnsi="Times New Roman" w:cs="Times New Roman"/>
+          <w:i/>
+          <w:iCs/>
+          <w:sz w:val="24"/>
+        </w:rPr>
+        <w:t xml:space="preserve">. Top 15 ingredients ranked by betweenness centrality in the global co-occurrence network. </w:t>
+      </w:r>
+    </w:p>
+    <w:p>
+      <w:pPr>
+        <w:rPr>
+          <w:rFonts w:ascii="Times New Roman" w:hAnsi="Times New Roman" w:cs="Times New Roman"/>
+          <w:sz w:val="24"/>
+        </w:rPr>
+      </w:pPr>
+      <w:r>
+        <w:rPr>
+          <w:rFonts w:ascii="Times New Roman" w:hAnsi="Times New Roman" w:cs="Times New Roman"/>
+          <w:sz w:val="24"/>
+        </w:rPr>
+        <w:t>These ingredients act as bridges connecting otherwise separated ingredient communities, enabling ingredient combinations across different cuisines.</w:t>
       </w:r>
     </w:p>
     <w:p>
@@ -1360,6 +2177,7 @@
           <w:rFonts w:ascii="Times New Roman" w:hAnsi="Times New Roman" w:cs="Times New Roman"/>
           <w:sz w:val="24"/>
         </w:rPr>
+        <w:lastRenderedPageBreak/>
         <w:t>High-betweenness ingredients often sit between clusters dominated by different cuisine groups. They act as connectors and may contribute to fusion cooking.</w:t>
       </w:r>
     </w:p>
@@ -1459,15 +2277,7 @@
           <w:rFonts w:ascii="Times New Roman" w:hAnsi="Times New Roman" w:cs="Times New Roman"/>
           <w:sz w:val="24"/>
         </w:rPr>
-        <w:t xml:space="preserve">The results show clear structural differences between Asian and Western ingredient networks. </w:t>
-      </w:r>
-      <w:r>
-        <w:rPr>
-          <w:rFonts w:ascii="Times New Roman" w:hAnsi="Times New Roman" w:cs="Times New Roman"/>
-          <w:sz w:val="24"/>
-        </w:rPr>
-        <w:lastRenderedPageBreak/>
-        <w:t>The Asian network contains more nodes and edges because the dataset includes many recipes with diverse spices, aromatics, and regional ingredients. The Western network is smaller but denser, which suggests that Western recipes reuse a more limited set of ingredients in many different combinations. These patterns reflect well-known differences in cooking traditions: Asian cuisines often rely on large spice sets and layered flavor building, while Western cuisines use smaller groups of herbs, dairy, and baking ingredients.</w:t>
+        <w:t>The results show clear structural differences between Asian and Western ingredient networks. The Asian network contains more nodes and edges because the dataset includes many recipes with diverse spices, aromatics, and regional ingredients. The Western network is smaller but denser, which suggests that Western recipes reuse a more limited set of ingredients in many different combinations. These patterns reflect well-known differences in cooking traditions: Asian cuisines often rely on large spice sets and layered flavor building, while Western cuisines use smaller groups of herbs, dairy, and baking ingredients.</w:t>
       </w:r>
     </w:p>
     <w:p>
@@ -1520,6 +2330,7 @@
           <w:rFonts w:ascii="Times New Roman" w:hAnsi="Times New Roman" w:cs="Times New Roman"/>
           <w:sz w:val="24"/>
         </w:rPr>
+        <w:lastRenderedPageBreak/>
         <w:t>The community detection results give a broader view of how ingredients form groups.</w:t>
       </w:r>
       <w:r>
@@ -1550,26 +2361,243 @@
       <w:pPr>
         <w:rPr>
           <w:rFonts w:ascii="Times New Roman" w:hAnsi="Times New Roman" w:cs="Times New Roman"/>
-          <w:sz w:val="24"/>
-        </w:rPr>
-      </w:pPr>
-    </w:p>
-    <w:p>
-      <w:pPr>
-        <w:rPr>
-          <w:rFonts w:ascii="Times New Roman" w:hAnsi="Times New Roman" w:cs="Times New Roman"/>
-          <w:sz w:val="24"/>
-        </w:rPr>
-      </w:pPr>
-      <w:r>
-        <w:rPr>
-          <w:rFonts w:ascii="Times New Roman" w:hAnsi="Times New Roman" w:cs="Times New Roman"/>
-          <w:sz w:val="24"/>
-        </w:rPr>
-        <w:pict w14:anchorId="5818C7CB">
-          <v:rect id="_x0000_i1025" style="width:0;height:1.5pt" o:hralign="center" o:hrstd="t" o:hr="t" fillcolor="#a0a0a0" stroked="f"/>
-        </w:pict>
-      </w:r>
+          <w:i/>
+          <w:iCs/>
+          <w:sz w:val="24"/>
+        </w:rPr>
+      </w:pPr>
+    </w:p>
+    <w:p>
+      <w:pPr>
+        <w:rPr>
+          <w:rFonts w:ascii="Times New Roman" w:hAnsi="Times New Roman" w:cs="Times New Roman" w:hint="eastAsia"/>
+          <w:i/>
+          <w:iCs/>
+          <w:sz w:val="24"/>
+        </w:rPr>
+      </w:pPr>
+      <w:r>
+        <w:rPr>
+          <w:rFonts w:ascii="Times New Roman" w:hAnsi="Times New Roman" w:cs="Times New Roman"/>
+          <w:i/>
+          <w:iCs/>
+          <w:sz w:val="24"/>
+        </w:rPr>
+        <w:t>Challenges and Reflections</w:t>
+      </w:r>
+    </w:p>
+    <w:p>
+      <w:pPr>
+        <w:rPr>
+          <w:rFonts w:ascii="Times New Roman" w:hAnsi="Times New Roman" w:cs="Times New Roman"/>
+          <w:sz w:val="24"/>
+        </w:rPr>
+      </w:pPr>
+      <w:r>
+        <w:rPr>
+          <w:rFonts w:ascii="Times New Roman" w:hAnsi="Times New Roman" w:cs="Times New Roman"/>
+          <w:sz w:val="24"/>
+        </w:rPr>
+        <w:t xml:space="preserve">The project encountered multiple obstacles which determined both the research scope and analytical direction. </w:t>
+      </w:r>
+      <w:r>
+        <w:rPr>
+          <w:rFonts w:ascii="Times New Roman" w:hAnsi="Times New Roman" w:cs="Times New Roman" w:hint="eastAsia"/>
+          <w:sz w:val="24"/>
+        </w:rPr>
+        <w:t>T</w:t>
+      </w:r>
+      <w:r>
+        <w:rPr>
+          <w:rFonts w:ascii="Times New Roman" w:hAnsi="Times New Roman" w:cs="Times New Roman"/>
+          <w:sz w:val="24"/>
+        </w:rPr>
+        <w:t>he f</w:t>
+      </w:r>
+      <w:r>
+        <w:rPr>
+          <w:rFonts w:ascii="Times New Roman" w:hAnsi="Times New Roman" w:cs="Times New Roman"/>
+          <w:sz w:val="24"/>
+        </w:rPr>
+        <w:t xml:space="preserve">irst major obstacle when we struggled to find suitable data that would answer our research questions. </w:t>
+      </w:r>
+      <w:r>
+        <w:rPr>
+          <w:rFonts w:ascii="Times New Roman" w:hAnsi="Times New Roman" w:cs="Times New Roman"/>
+          <w:sz w:val="24"/>
+        </w:rPr>
+        <w:t>All the</w:t>
+      </w:r>
+      <w:r>
+        <w:rPr>
+          <w:rFonts w:ascii="Times New Roman" w:hAnsi="Times New Roman" w:cs="Times New Roman"/>
+          <w:sz w:val="24"/>
+        </w:rPr>
+        <w:t xml:space="preserve"> available public recipe datasets contain either no specific regional identification or they combine different culinary traditions without showing which dishes belong to Asian or Western categories. The lack of distinguishable Asian and Western cuisine groups in the dataset forced us to perform extra filtering operations before starting any analysis.</w:t>
+      </w:r>
+    </w:p>
+    <w:p>
+      <w:pPr>
+        <w:rPr>
+          <w:rFonts w:ascii="Times New Roman" w:hAnsi="Times New Roman" w:cs="Times New Roman"/>
+          <w:sz w:val="24"/>
+        </w:rPr>
+      </w:pPr>
+    </w:p>
+    <w:p>
+      <w:pPr>
+        <w:rPr>
+          <w:rFonts w:ascii="Times New Roman" w:hAnsi="Times New Roman" w:cs="Times New Roman"/>
+          <w:sz w:val="24"/>
+        </w:rPr>
+      </w:pPr>
+      <w:r>
+        <w:rPr>
+          <w:rFonts w:ascii="Times New Roman" w:hAnsi="Times New Roman" w:cs="Times New Roman"/>
+          <w:sz w:val="24"/>
+        </w:rPr>
+        <w:t xml:space="preserve">And </w:t>
+      </w:r>
+      <w:r>
+        <w:rPr>
+          <w:rFonts w:ascii="Times New Roman" w:hAnsi="Times New Roman" w:cs="Times New Roman"/>
+          <w:sz w:val="24"/>
+        </w:rPr>
+        <w:t xml:space="preserve">data cleaning proved to be extremely difficult to manage. </w:t>
+      </w:r>
+      <w:r>
+        <w:rPr>
+          <w:rFonts w:ascii="Times New Roman" w:hAnsi="Times New Roman" w:cs="Times New Roman"/>
+          <w:sz w:val="24"/>
+        </w:rPr>
+        <w:t>Because t</w:t>
+      </w:r>
+      <w:r>
+        <w:rPr>
+          <w:rFonts w:ascii="Times New Roman" w:hAnsi="Times New Roman" w:cs="Times New Roman"/>
+          <w:sz w:val="24"/>
+        </w:rPr>
+        <w:t xml:space="preserve">he database contained multiple versions of identical ingredients which used different names and spellings and formats and languages including Hindi script entries. The ingredients used in similar dishes appeared with different lists of ingredients between different recipe versions. </w:t>
+      </w:r>
+      <w:r>
+        <w:rPr>
+          <w:rFonts w:ascii="Times New Roman" w:hAnsi="Times New Roman" w:cs="Times New Roman"/>
+          <w:sz w:val="24"/>
+        </w:rPr>
+        <w:t>A</w:t>
+      </w:r>
+      <w:r>
+        <w:rPr>
+          <w:rFonts w:ascii="Times New Roman" w:hAnsi="Times New Roman" w:cs="Times New Roman"/>
+          <w:sz w:val="24"/>
+        </w:rPr>
+        <w:t>nalysis required node count and co-occurrence pattern because these inconsistencies affected the network construction process. The Asian collection contained more items than the Western collection which resulted in an unbalanced situation that endangered the global network structure and produced biased results in our comparison analysis.</w:t>
+      </w:r>
+    </w:p>
+    <w:p>
+      <w:pPr>
+        <w:rPr>
+          <w:rFonts w:ascii="Times New Roman" w:hAnsi="Times New Roman" w:cs="Times New Roman"/>
+          <w:sz w:val="24"/>
+        </w:rPr>
+      </w:pPr>
+    </w:p>
+    <w:p>
+      <w:pPr>
+        <w:rPr>
+          <w:rFonts w:ascii="Times New Roman" w:hAnsi="Times New Roman" w:cs="Times New Roman"/>
+          <w:sz w:val="24"/>
+        </w:rPr>
+      </w:pPr>
+      <w:r>
+        <w:rPr>
+          <w:rFonts w:ascii="Times New Roman" w:hAnsi="Times New Roman" w:cs="Times New Roman"/>
+          <w:sz w:val="24"/>
+        </w:rPr>
+        <w:t>Furthermore, c</w:t>
+      </w:r>
+      <w:r>
+        <w:rPr>
+          <w:rFonts w:ascii="Times New Roman" w:hAnsi="Times New Roman" w:cs="Times New Roman"/>
+          <w:sz w:val="24"/>
+        </w:rPr>
+        <w:t xml:space="preserve">reating visualizations turned out to be more difficult than we had expected. The network containing 1800+ ingredients produced un-readable dense graphs when we tried to display the complete network. The Louvain method for community detection required </w:t>
+      </w:r>
+      <w:r>
+        <w:rPr>
+          <w:rFonts w:ascii="Times New Roman" w:hAnsi="Times New Roman" w:cs="Times New Roman"/>
+          <w:sz w:val="24"/>
+        </w:rPr>
+        <w:lastRenderedPageBreak/>
+        <w:t>multiple tests because it produced different network partitions when the ingredient set contained noise and the network size varied.</w:t>
+      </w:r>
+    </w:p>
+    <w:p>
+      <w:pPr>
+        <w:rPr>
+          <w:rFonts w:ascii="Times New Roman" w:hAnsi="Times New Roman" w:cs="Times New Roman"/>
+          <w:sz w:val="24"/>
+        </w:rPr>
+      </w:pPr>
+    </w:p>
+    <w:p>
+      <w:pPr>
+        <w:rPr>
+          <w:rFonts w:ascii="Times New Roman" w:hAnsi="Times New Roman" w:cs="Times New Roman"/>
+          <w:sz w:val="24"/>
+        </w:rPr>
+      </w:pPr>
+      <w:r>
+        <w:rPr>
+          <w:rFonts w:ascii="Times New Roman" w:hAnsi="Times New Roman" w:cs="Times New Roman"/>
+          <w:sz w:val="24"/>
+        </w:rPr>
+        <w:t xml:space="preserve">Our research team would use multiple approaches to improve study results when conducting this research again. We would develop an automated system to merge ingredient synonyms through either lexical databases or vector space similarity calculations. The analysis needs ingredient quantity information to create weighted networks which show the importance of ingredients in recipes. </w:t>
+      </w:r>
+      <w:r>
+        <w:rPr>
+          <w:rFonts w:ascii="Times New Roman" w:hAnsi="Times New Roman" w:cs="Times New Roman"/>
+          <w:sz w:val="24"/>
+        </w:rPr>
+        <w:t>It</w:t>
+      </w:r>
+      <w:r>
+        <w:rPr>
+          <w:rFonts w:ascii="Times New Roman" w:hAnsi="Times New Roman" w:cs="Times New Roman"/>
+          <w:sz w:val="24"/>
+        </w:rPr>
+        <w:t xml:space="preserve"> would gain from using different modeling techniques which include flavor compound networks and neural embedding models to reveal additional data points. </w:t>
+      </w:r>
+      <w:r>
+        <w:rPr>
+          <w:rFonts w:ascii="Times New Roman" w:hAnsi="Times New Roman" w:cs="Times New Roman"/>
+          <w:sz w:val="24"/>
+        </w:rPr>
+        <w:t>Maybe t</w:t>
+      </w:r>
+      <w:r>
+        <w:rPr>
+          <w:rFonts w:ascii="Times New Roman" w:hAnsi="Times New Roman" w:cs="Times New Roman"/>
+          <w:sz w:val="24"/>
+        </w:rPr>
+        <w:t>he analysis of multiple datasets would help us confirm our findings by using different data sources which would reduce the effect of specific dataset restrictions.</w:t>
+      </w:r>
+    </w:p>
+    <w:p>
+      <w:pPr>
+        <w:rPr>
+          <w:rFonts w:ascii="Times New Roman" w:hAnsi="Times New Roman" w:cs="Times New Roman"/>
+          <w:sz w:val="24"/>
+        </w:rPr>
+      </w:pPr>
+    </w:p>
+    <w:p>
+      <w:pPr>
+        <w:rPr>
+          <w:rFonts w:ascii="Times New Roman" w:hAnsi="Times New Roman" w:cs="Times New Roman"/>
+          <w:sz w:val="24"/>
+        </w:rPr>
+      </w:pPr>
     </w:p>
     <w:p>
       <w:pPr>
@@ -1587,7 +2615,6 @@
           <w:bCs/>
           <w:sz w:val="24"/>
         </w:rPr>
-        <w:lastRenderedPageBreak/>
         <w:t>Conclusion</w:t>
       </w:r>
     </w:p>
@@ -1672,7 +2699,15 @@
           <w:sz w:val="24"/>
         </w:rPr>
         <w:br/>
-        <w:t>The dataset contains many Indian recipes, which influences the Asian network. Some ingredients appear under multiple names or scripts, and the co-occurrence approach does not include quantities or cooking methods. These factors may affect the structure of the networks. Future work could merge ingredient synonyms, use weighted networks based on ingredient amounts, incorporate flavor chemistry, or apply additional community detection methods.</w:t>
+        <w:t xml:space="preserve">The dataset contains many Indian recipes, which influences the Asian network. Some ingredients appear under multiple names or scripts, and the co-occurrence approach does not </w:t>
+      </w:r>
+      <w:r>
+        <w:rPr>
+          <w:rFonts w:ascii="Times New Roman" w:hAnsi="Times New Roman" w:cs="Times New Roman"/>
+          <w:sz w:val="24"/>
+        </w:rPr>
+        <w:lastRenderedPageBreak/>
+        <w:t>include quantities or cooking methods. These factors may affect the structure of the networks. Future work could merge ingredient synonyms, use weighted networks based on ingredient amounts, incorporate flavor chemistry, or apply additional community detection methods.</w:t>
       </w:r>
     </w:p>
     <w:p>
@@ -1689,6 +2724,134 @@
         </w:rPr>
         <w:t>Despite these limitations, the analysis demonstrates that network science provides a useful way to study cooking patterns and cultural connections. The networks highlight both the distinct characteristics of Asian and Western cuisines and the ingredients that bring them together.</w:t>
       </w:r>
+    </w:p>
+    <w:p>
+      <w:pPr>
+        <w:rPr>
+          <w:rFonts w:ascii="Times New Roman" w:hAnsi="Times New Roman" w:cs="Times New Roman"/>
+          <w:sz w:val="24"/>
+        </w:rPr>
+      </w:pPr>
+    </w:p>
+    <w:p>
+      <w:pPr>
+        <w:rPr>
+          <w:rFonts w:ascii="Times New Roman" w:hAnsi="Times New Roman" w:cs="Times New Roman"/>
+          <w:sz w:val="24"/>
+        </w:rPr>
+      </w:pPr>
+    </w:p>
+    <w:p>
+      <w:pPr>
+        <w:rPr>
+          <w:rFonts w:ascii="Times New Roman" w:hAnsi="Times New Roman" w:cs="Times New Roman"/>
+          <w:sz w:val="24"/>
+        </w:rPr>
+      </w:pPr>
+    </w:p>
+    <w:p>
+      <w:pPr>
+        <w:rPr>
+          <w:rFonts w:ascii="Times New Roman" w:hAnsi="Times New Roman" w:cs="Times New Roman"/>
+          <w:sz w:val="24"/>
+        </w:rPr>
+      </w:pPr>
+    </w:p>
+    <w:p>
+      <w:pPr>
+        <w:rPr>
+          <w:rFonts w:ascii="Times New Roman" w:hAnsi="Times New Roman" w:cs="Times New Roman"/>
+          <w:sz w:val="24"/>
+        </w:rPr>
+      </w:pPr>
+    </w:p>
+    <w:p>
+      <w:pPr>
+        <w:rPr>
+          <w:rFonts w:ascii="Times New Roman" w:hAnsi="Times New Roman" w:cs="Times New Roman"/>
+          <w:sz w:val="24"/>
+        </w:rPr>
+      </w:pPr>
+    </w:p>
+    <w:p>
+      <w:pPr>
+        <w:rPr>
+          <w:rFonts w:ascii="Times New Roman" w:hAnsi="Times New Roman" w:cs="Times New Roman"/>
+          <w:sz w:val="24"/>
+        </w:rPr>
+      </w:pPr>
+    </w:p>
+    <w:p>
+      <w:pPr>
+        <w:rPr>
+          <w:rFonts w:ascii="Times New Roman" w:hAnsi="Times New Roman" w:cs="Times New Roman"/>
+          <w:sz w:val="24"/>
+        </w:rPr>
+      </w:pPr>
+    </w:p>
+    <w:p>
+      <w:pPr>
+        <w:rPr>
+          <w:rFonts w:ascii="Times New Roman" w:hAnsi="Times New Roman" w:cs="Times New Roman"/>
+          <w:sz w:val="24"/>
+        </w:rPr>
+      </w:pPr>
+    </w:p>
+    <w:p>
+      <w:pPr>
+        <w:rPr>
+          <w:rFonts w:ascii="Times New Roman" w:hAnsi="Times New Roman" w:cs="Times New Roman"/>
+          <w:sz w:val="24"/>
+        </w:rPr>
+      </w:pPr>
+    </w:p>
+    <w:p>
+      <w:pPr>
+        <w:rPr>
+          <w:rFonts w:ascii="Times New Roman" w:hAnsi="Times New Roman" w:cs="Times New Roman"/>
+          <w:sz w:val="24"/>
+        </w:rPr>
+      </w:pPr>
+    </w:p>
+    <w:p>
+      <w:pPr>
+        <w:rPr>
+          <w:rFonts w:ascii="Times New Roman" w:hAnsi="Times New Roman" w:cs="Times New Roman"/>
+          <w:sz w:val="24"/>
+        </w:rPr>
+      </w:pPr>
+    </w:p>
+    <w:p>
+      <w:pPr>
+        <w:rPr>
+          <w:rFonts w:ascii="Times New Roman" w:hAnsi="Times New Roman" w:cs="Times New Roman"/>
+          <w:sz w:val="24"/>
+        </w:rPr>
+      </w:pPr>
+    </w:p>
+    <w:p>
+      <w:pPr>
+        <w:rPr>
+          <w:rFonts w:ascii="Times New Roman" w:hAnsi="Times New Roman" w:cs="Times New Roman"/>
+          <w:sz w:val="24"/>
+        </w:rPr>
+      </w:pPr>
+    </w:p>
+    <w:p>
+      <w:pPr>
+        <w:rPr>
+          <w:rFonts w:ascii="Times New Roman" w:hAnsi="Times New Roman" w:cs="Times New Roman"/>
+          <w:sz w:val="24"/>
+        </w:rPr>
+      </w:pPr>
+    </w:p>
+    <w:p>
+      <w:pPr>
+        <w:rPr>
+          <w:rFonts w:ascii="Times New Roman" w:hAnsi="Times New Roman" w:cs="Times New Roman"/>
+          <w:sz w:val="24"/>
+        </w:rPr>
+      </w:pPr>
     </w:p>
     <w:p>
       <w:pPr>
@@ -1963,7 +3126,27 @@
           <w:iCs/>
           <w:sz w:val="24"/>
         </w:rPr>
-        <w:t>Social Computing and Social Media: SCSM 2018</w:t>
+        <w:t xml:space="preserve">Social Computing and </w:t>
+      </w:r>
+      <w:proofErr w:type="gramStart"/>
+      <w:r>
+        <w:rPr>
+          <w:rFonts w:ascii="Times New Roman" w:hAnsi="Times New Roman" w:cs="Times New Roman"/>
+          <w:i/>
+          <w:iCs/>
+          <w:sz w:val="24"/>
+        </w:rPr>
+        <w:t>Social Media</w:t>
+      </w:r>
+      <w:proofErr w:type="gramEnd"/>
+      <w:r>
+        <w:rPr>
+          <w:rFonts w:ascii="Times New Roman" w:hAnsi="Times New Roman" w:cs="Times New Roman"/>
+          <w:i/>
+          <w:iCs/>
+          <w:sz w:val="24"/>
+        </w:rPr>
+        <w:t>: SCSM 2018</w:t>
       </w:r>
       <w:r>
         <w:rPr>
@@ -2237,7 +3420,7 @@
         <w:br/>
         <w:t xml:space="preserve"> Retrieved from:</w:t>
       </w:r>
-      <w:hyperlink r:id="rId8" w:history="1">
+      <w:hyperlink r:id="rId15" w:history="1">
         <w:r>
           <w:rPr>
             <w:rStyle w:val="af2"/>
@@ -3161,7 +4344,6 @@
   <w:style w:type="character" w:default="1" w:styleId="a0">
     <w:name w:val="Default Paragraph Font"/>
     <w:uiPriority w:val="1"/>
-    <w:semiHidden/>
     <w:unhideWhenUsed/>
   </w:style>
   <w:style w:type="table" w:default="1" w:styleId="a1">

</xml_diff>